<commit_message>
Update by Opus 4.8.
</commit_message>
<xml_diff>
--- a/papers/Fable-Computer-Part-I.docx
+++ b/papers/Fable-Computer-Part-I.docx
@@ -17,7 +17,7 @@
           <w:color w:val="345A8A"/>
           <w:sz w:val="26"/>
         </w:rPr>
-        <w:t>Concept, Architecture, and Reduced-Order Feasibility — Revision v5.5 (July 2026: kinetic-correction update)</w:t>
+        <w:t>Concept, Architecture, and Reduced-Order Feasibility — Revision v5.6 (July 2026: boundary-channel and gain-budget update)</w:t>
       </w:r>
     </w:p>
     <w:p>
@@ -873,7 +873,7 @@
     </w:p>
     <w:p>
       <w:r>
-        <w:t>Subsystem precedents. Every subsystem of the fabric rests on a demonstrated technology; the fabric is the integration. Table 2 collects them, with the demonstration conditions stated — two of the five were demonstrated under conditions weaker than the fabric requires, and are flagged.</w:t>
+        <w:t>Subsystem precedents. Every subsystem of the fabric rests on a demonstrated technology; the fabric is the integration. Table 2 collects them, with the demonstration conditions stated — four of the five were demonstrated under conditions weaker than the fabric requires, and are flagged.</w:t>
       </w:r>
     </w:p>
     <w:tbl>
@@ -2042,7 +2042,7 @@
     </w:p>
     <w:p>
       <w:r>
-        <w:t xml:space="preserve">The lifetime row is a best-case assumption, stated as such: τ = 1 ps at n = 10¹² cm⁻² corresponds to mobility ≈ 86,000 cm²/Vs at 300 K — inside the demonstrated envelope of hBN-encapsulated graphene (~140,000 cm²/Vs near the acoustic-phonon limit [33]) but premium-material territory. The measured room-temperature baseline for propagating acoustic THz plasmons is shorter (τ ≈ 0.4–0.6 ps, Q ≈ 2.4–3.8 [39, 40]); the fundamental, phonon-set ceiling on plasmon lifetime in this stack is mapped in [42]; and gate-metal ohmic loss, not included in τ, adds to the budget at small d [41]. The protocol’s calibration sequence measures τ on-die first (Section 10).</w:t>
+        <w:t xml:space="preserve">The lifetime row is a best-case assumption, stated as such: τ = 1 ps at n = 10¹² cm⁻² corresponds to mobility ≈ 86,000 cm²/Vs at 300 K — inside the demonstrated envelope of hBN-encapsulated graphene (~140,000 cm²/Vs near the acoustic-phonon limit [33]) but premium-material territory. The measured room-temperature baseline for propagating acoustic THz plasmons is shorter (τ ≈ 0.4–0.6 ps, Q ≈ 2.5–3.8 [39, 40]); the fundamental, phonon-set ceiling on plasmon lifetime in this stack is mapped in [42]; and gate-metal ohmic loss, not included in τ, adds to the budget at small d [41]. The protocol’s calibration sequence measures τ on-die first (Section 10).</w:t>
       </w:r>
     </w:p>
     <w:p>
@@ -3476,7 +3476,7 @@
     </w:p>
     <w:p>
       <w:r>
-        <w:t xml:space="preserve">A drift-Doppler cascade model established two independent failures at the highest candidate density, n = 10¹³ cm⁻² — the natural first choice for a robust, well-confined plasmon. Bulk convective gain is impossible: the density-dependent saturation velocity v_sat(n) ≈ ω_OP/k_F, with ω_OP the graphene optical-phonon frequency (≈ 4.5–5.4×10⁵ m/s at 10¹³ cm⁻² [9], against s ≈ 4×10⁶ m/s there) caps v_d/v_p at ≈ 0.13, so uniform drift can at best halve the per-gate loss — transparency is unreachable. Independently, the drive heat at that density (~190 kW/cm² at v_sat) caps the duty cycle at well under 1 % at any fill convention under the 80 °C budget. Both failures point the same way: lower density, resonant cells. The demonstrated amplification of [2] is consistent with this conclusion — it is a resonant, boundary-mediated effect by any of its candidate explanations (Section 2), not bulk traveling-wave gain.</w:t>
+        <w:t xml:space="preserve">A drift-Doppler cascade model established two independent failures at the highest candidate density, n = 10¹³ cm⁻² — the natural first choice for a robust, well-confined plasmon. Bulk convective gain is impossible: the density-dependent saturation velocity v_sat(n) ≈ ω_OP/k_F ≈ 4.5–5.4×10⁵ m/s at 10¹³ cm⁻² [9] (against s ≈ 4×10⁶ m/s there), with ω_OP the graphene optical-phonon frequency, caps v_d/v_p at ≈ 0.13, so uniform drift can at best halve the per-gate loss — transparency is unreachable. Independently, the drive heat at that density (~190 kW/cm² at v_sat) caps the duty cycle at well under 1 % at any fill convention under the 80 °C budget. Both failures point the same way: lower density, resonant cells. The demonstrated amplification of [2] is consistent with this conclusion — it is a resonant, boundary-mediated effect by any of its candidate explanations (Section 2), not bulk traveling-wave gain.</w:t>
       </w:r>
     </w:p>
     <w:p>
@@ -3631,12 +3631,12 @@
     </w:p>
     <w:p>
       <w:r>
-        <w:t>A nonlinear shallow-water solver with the DS boundary conditions confirms what the transit picture misses: below its oscillation threshold the cell is a multi-pass regenerative amplifier. The cavity transfer is a Fabry-Perot below threshold — the current-clamped drain reflects with amplitude (s + v₀)/(s − v₀) &gt; 1, the density-clamped source with |r| = 1, and the round-trip loop closes self-oscillation at loop gain unity, which recovers M_th of Eq. (3) exactly. The solver’s numerical dissipation inflates its measured threshold to M_th,num ≈ 0.17, about 15 % above the analytic 0.147 — a Lax-Friedrichs diffusion artifact now derived from first principles: the exact linearized operator of the released scheme (community notes, July 2026; shipped as a runnable listing) reproduces the measured offset to 0.11 % and converges to the analytic value at first order in Δx (M_th,lin = 0.1688/0.1588/0.1540 at N = 240/480/960); the corresponding released-chain rerun at N = 480 has now been executed: M_th,num = 0.158748, confirming the pre-registered 0.1590 ± 0.0010 — the convergence claim is demonstrated at the released-chain level (Appendix A) — so all solver results are quoted at the ratio M/M_th,num. Net gain referenced to the identical passive cell rises from break-even (cancelling the 2.56 dB per-gate loss — one λ_p/2 of propagation, Appendix A) at M/M_th ≈ 0.3 through +9.7 dB continuous-wave at M/M_th ≈ 0.7 toward formal divergence at threshold. The cell is low-Q (Q ≈ 6), so an isolated few-cycle pulse does not fully charge it: the analytic recirculation of a single 3-cycle burst yields ≈ +6.3 dB, about 3.4 dB below the continuous-wave ceiling. Driven with the actual clock waveform — 3-cycle pulses at 0.25 THz, a ≈ 75 %-duty train in which each pulse rides the cavity field left by its predecessors — the solver delivers ≈ +8 dB per pulse in steady streaming operation. Community analysis (July 2026; the promoted calibration notes in the project repository) shows that for this streaming train the residual gap to the continuous-wave figure is not buildup physics (≲ 0.1 dB in an energy metric). The exact linearized operator of the released solver — constructed term-by-term from its update and ghost-cell algebra and shipped as a runnable listing in the notes — settles the split: linear numerics (drive detuning from the zero-drift cavity length, interior Lax-Friedrichs diffusion, and a drift-induced boundary loss at the drain’s discrete reflection) account for 0.956 dB of the 1.864 dB gap, and the remaining 0.909 dB is pulse-train structure, drive-amplitude compression near the 1 %-swing knee, and the per-slot estimator (that split is open pending a drive sweep). The same operator reproduces the solver’s measured threshold to 0.11 % and gives the effective round-trip amplitude exactly (l_a = 0.9110; the boundary loss is drift-induced — the passive cavity’s boundaries are lossless in-model, so no scalar boundary factor exists). The exported +8 dB is therefore conservative for a design-length cell; the pre-registered expectations have now been run and resolved (notes/2026-07-12-predictions-resolved.md): the retuned solver run measures +9.22 dB (predicted +9.05 ± 0.30 — confirmed; the detuning artifact is empirically established, +1.43 dB recovered at identical bias, drive, and grid), M_th,num(N = 480) measures 0.158748 (predicted 0.1590 ± 0.0010 — confirmed, within 5×10⁻⁴ of the exact operator’s linear value), and the half-bias check measures +5.13 dB (predicted +5.08 ± 0.30 — confirmed). Baselines were replicated bit-for-bit before any variant ran. Adoption of the retuned cavity length in the released chain is queued as WP1 work; until it lands, the shipped key retains the 7.80 dB configuration value. Near threshold the cell rings: the cavity ring-down reaches ~4–5 ps (comparable to the slot) and the pulse-to-pulse spread reaches 5 dB by 0.94·M_th. This is the regenerative amplifier’s classic gain-versus-stability trade-off, and it is why the working point is held at 0.7·M_th — where the ring-down both lifts the per-pulse gain to its +8 dB streaming value and sets the inter-symbol budget the re-sync stations manage (Section 6.2). Every gain figure in this pass is a hydrodynamic-tier figure, and each now carries a signed kinetic correction rather than an unsigned uncertainty: −0.95 dB per cell at 353 K at the tracked operating point, band [−1.5, −0.3] dB, in-model, plus a separate open ±1 dB boundary allowance (Section 7.5). None of the numbers above moves — the correction is stated on the ledger, not folded into it, and the tier that owns it has not run. It is worth recording why the correction is a decibel and not several: the tracked-ratio convention of Section 5 absorbs the kinetic shift of the boundary gain into bias current, and at a bias frozen at 0.7·M_th(hydro) the same physics would have cost −2.5 dB at the same temperature.</w:t>
-      </w:r>
-    </w:p>
-    <w:p>
-      <w:r>
-        <w:t xml:space="preserve">Because the operating drift sits far below v_sat(10¹²) ≈ 1.4×10⁶ m/s, Joule heat falls ~25-fold against an at-v_sat drive at the same density, and ~100-fold against the Pass-1 corner. Of that ~100×, the dominant ~32× comes from the density itself (heat ∝ n·m*·v², with the effective mass m* = E_F/v_F² ∝ √n) and only ~3× from operating below the v_sat ≈ 5×10⁵ m/s of the high-density case. The exact periodic-slab thermal solution then gives the duty figures of Section 8.2. Heat stops selecting the density — disorder takes over that role: the chain’s disorder Monte-Carlo (Figure 9D, reported with Pass 4) gave ~87–100 % cell yield at n = 10¹² over a broad disorder sweep, degrading steadily toward 10¹¹ as the logic swing approaches the puddle scale; restricting to the literature disorder values (Section 7.4) tightens the n = 10¹² yield to 98–100 %.</w:t>
+        <w:t>A nonlinear shallow-water solver with the DS boundary conditions confirms what the transit picture misses: below its oscillation threshold the cell is a multi-pass regenerative amplifier. The cavity transfer is a Fabry-Perot below threshold — the current-clamped drain reflects with amplitude (s + v₀)/(s − v₀) &gt; 1, the density-clamped source with |r| = 1, and the round-trip loop closes self-oscillation at loop gain unity, which recovers M_th of Eq. (3) exactly. The solver’s numerical dissipation inflates its measured threshold to M_th,num ≈ 0.17, about 15 % above the analytic 0.147 — a Lax-Friedrichs diffusion artifact now derived from first principles: the exact linearized operator of the released scheme (community notes, July 2026; shipped as a runnable listing) reproduces the measured offset to 0.11 % and converges to the analytic value at first order in Δx (M_th,lin = 0.1688/0.1588/0.1540 at N = 240/480/960); the corresponding released-chain rerun at N = 480 has now been executed: M_th,num = 0.158748, confirming the pre-registered 0.1590 ± 0.0010 — the convergence claim is demonstrated at the released-chain level (Appendix A) — so all solver results are quoted at the ratio M/M_th,num. Net gain referenced to the identical passive cell rises from break-even (cancelling the 2.56 dB per-gate loss — one λ_p/2 of propagation, Appendix A) at M/M_th ≈ 0.3 through +9.7 dB continuous-wave at M/M_th ≈ 0.7 toward formal divergence at threshold. The cell is low-Q (Q ≈ 6), so an isolated few-cycle pulse does not fully charge it: the analytic recirculation of a single 3-cycle burst yields ≈ +6.3 dB, about 3.4 dB below the continuous-wave ceiling. Driven with the actual clock waveform — 3-cycle pulses at 0.25 THz, a ≈ 75 %-duty train in which each pulse rides the cavity field left by its predecessors — the solver delivers ≈ +8 dB per pulse in steady streaming operation. Community analysis (July 2026; the promoted calibration notes in the project repository) shows that for this streaming train the residual gap to the continuous-wave figure is not buildup physics (≲ 0.1 dB in an energy metric). The exact linearized operator of the released solver — constructed term-by-term from its update and ghost-cell algebra and shipped as a runnable listing in the notes — settles the split: linear numerics (drive detuning from the zero-drift cavity length, interior Lax-Friedrichs diffusion, and a drift-induced boundary loss at the drain’s discrete reflection) account for 0.956 dB of the 1.864 dB gap, and the remaining 0.908 dB is pulse-train structure, drive-amplitude compression near the 1 %-swing knee, and the per-slot estimator (a drive-amplitude sweep of the released solver since resolves that split as ≈0.87 dB pulse-train/per-slot-estimator convention plus ≈0.06 dB compression at the operating drive; Appendix A). The same operator reproduces the solver’s measured threshold to 0.11 % and gives the effective round-trip amplitude exactly (l_a = 0.9110; the boundary loss is drift-induced — the passive cavity’s boundaries are lossless in-model, so no scalar boundary factor exists). The exported +8 dB is therefore conservative for a design-length cell; the pre-registered expectations have now been run and resolved (notes/2026-07-12-predictions-resolved.md): the retuned solver run measures +9.22 dB (predicted +9.05 ± 0.30 — confirmed; the detuning artifact is empirically established, +1.43 dB recovered at identical bias, drive, and grid), M_th,num(N = 480) measures 0.158748 (predicted 0.1590 ± 0.0010 — confirmed, within 5×10⁻⁴ of the exact operator’s linear value), and the half-bias check measures +5.13 dB (predicted +5.08 ± 0.30 — confirmed). Baselines were replicated bit-for-bit before any variant ran. Adoption of the retuned cavity length in the released chain is queued as WP1 work; until it lands, the shipped key retains the 7.80 dB configuration value. Near threshold the cell rings: the cavity ring-down reaches ~4–5 ps (comparable to the slot) and the pulse-to-pulse spread reaches 5 dB by 0.94·M_th. This is the regenerative amplifier’s classic gain-versus-stability trade-off, and it is why the working point is held at 0.7·M_th — where the ring-down both lifts the per-pulse gain to its +8 dB streaming value and sets the inter-symbol budget the re-sync stations manage (Section 6.2). Every gain figure in this pass is a hydrodynamic-tier figure, and each now carries a signed kinetic correction rather than an unsigned uncertainty: −0.95 dB per cell at 353 K at the tracked operating point, band [−1.5, −0.3] dB, in-model, plus a separate open ±1 dB boundary allowance (Section 7.5). None of the numbers above moves — the correction is stated on the ledger, not folded into it, and the tier that owns it has not run. It is worth recording why the correction is a decibel and not several: the tracked-ratio convention of Section 5 absorbs the kinetic shift of the boundary gain into bias current, and at a bias frozen at 0.7·M_th(hydro) the same physics would have cost −2.5 dB at the same temperature.</w:t>
+      </w:r>
+    </w:p>
+    <w:p>
+      <w:r>
+        <w:t xml:space="preserve">Because the operating drift sits far below v_sat(10¹²) ≈ 1.4×10⁶ m/s, Joule heat falls ~25-fold against an at-v_sat drive at the same density, and ~150-fold against the Pass-1 corner. Of that ~150×, the dominant ~32× comes from the density itself (heat ∝ n·m*·v², with the effective mass m* = E_F/v_F² ∝ √n) and only ~5× from operating below the v_sat ≈ 5×10⁵ m/s of the high-density case. The exact periodic-slab thermal solution then gives the duty figures of Section 8.2. Heat stops selecting the density — disorder takes over that role: the chain’s disorder Monte-Carlo (Figure 9D, reported with Pass 4) gave ~87–100 % cell yield at n = 10¹² over a broad disorder sweep, degrading steadily toward 10¹¹ as the logic swing approaches the puddle scale; restricting to the literature disorder values (Section 7.4) tightens the n = 10¹² yield to 98–100 %.</w:t>
       </w:r>
     </w:p>
     <w:p>
@@ -3739,7 +3739,7 @@
     </w:p>
     <w:p>
       <w:r>
-        <w:t xml:space="preserve">Finally, literature disorder values (σ ≈ 2.5×10⁹ cm⁻² for graphene on ultra-flat hBN [12]; ~4×10¹⁰ cm⁻² for typical encapsulated stacks [14], with SiO₂-substrate values an order higher as the upper bound [13]) place cell yield at n = 10¹² at 98–100 % across the realistic range; 3×10¹¹ is a premium-material option (graphite-gate class). The yield criterion is explicit: a charge puddle of rms density σ broadens the cell’s threshold to √((n/k₀)² + σ²), so the puddle-broadened sharpness clears the regeneration floor only while σ stays below ≈ 0.16·n — the swing-to-puddle rule, tied directly to the k ≥ 8 design sharpness (Appendix A).</w:t>
+        <w:t xml:space="preserve">Finally, literature disorder values (σ ≈ 2.5×10⁹ cm⁻² for graphene on ultra-flat hBN [12]; ~4×10¹⁰ cm⁻² for typical encapsulated stacks [14], with SiO₂-substrate values an order higher as the upper bound [13]) place cell yield at n = 10¹² at 98–100 % across the realistic range; 3×10¹¹ is a premium-material option (graphite-gate class). The yield criterion is explicit: a charge puddle of rms density σ broadens the cell’s threshold to √((n/k)² + σ²), so the puddle-broadened sharpness clears the regeneration floor only while σ stays below ≈ 0.16·n — the swing-to-puddle rule, tied directly to the k ≥ 8 design sharpness (Appendix A).</w:t>
       </w:r>
     </w:p>
     <w:p>
@@ -3823,7 +3823,7 @@
         <w:t xml:space="preserve">Kinetic validity. </w:t>
       </w:r>
       <w:r>
-        <w:t>The hydrodynamic equations behind Eq. (2) and the Pass-3 solver assume electron-electron collisions fast enough to keep the electron system a local fluid — quantified by ωτ_ee ≪ 1. The standard estimate for graphene’s electron-electron rate, 1/τ_ee ≈ (k_BT)²/(ħE_F) [15], gives τ_ee ≈ 115 fs at 300 K and E_F = 117 meV — i.e. ωτ_ee ≈ 0.7 at 1 THz. Two qualifications belong with that number. Its rate prefactor is uncertain by a factor of a few — the Fermi-liquid log, screening and coupling-constant spreads, and the fact that the stress-relaxation time the wave actually samples is not the quasiparticle lifetime (measured graphene viscosities sit inside that band). And the group is temperature-dependent in the design’s favour: with τ_ee ∝ T⁻², at the 353 K cap τ_ee ≈ 83 fs and ωτ_ee ≈ 0.52, so hydrodynamics is better at the hot end, which is where the fabric runs. The honest statement is that the hydrodynamic description at 1 THz and 300 K is marginal, not comfortable: ωτ_ee ≈ 0.7 sits at the collisional-to-collisionless crossover — the same crossover observed experimentally as the transition from acoustic plasmon to electronic sound [10] — with ℓ_ee/L ≈ 0.2 (0.14 at the cap, where the sharper wave-kinetic Knudsen numbers are q₋·ℓ_ee = 0.25 and q₊·ℓ_ee = 0.20), and the viscous correction ν q² (ν = v_F²τ_ee/4) is ≈ 20 % of 1/τ — a 300 K figure that reads 0.13 at the cap, and that overstates the actual dissipative supplement in the conservative direction, since the collisionless crossover reduces it by 1/(1 + (ωτ_ee)²) to ≈ 0.10 of 1/τ there. The cell is marginal in space as well: L/ℓ_mfp ≈ 0.6–0.7 with ℓ_mfp = v_F·τ the momentum-relaxation mean free path, so transport in the cell is neither cleanly hydrodynamic nor cleanly ballistic. The gain numbers of Passes 3–4 therefore carry a kinetic correction, and its certification passes to the Boltzmann–Maxwell tier as that tier’s highest-priority question (Section 10) — but the correction is no longer unsigned. A community note promoted by a 3-of-3 agent vote (notes/2026-07-13-kinetic-correction-signed-band.md, July 2026) closes the system one tier up in the Maxwell/Mermin viscoelastic generalization of the shallow-water equations, ν(ω) = ν₀/(1 − iωτ_ee) with ν₀ = v_F²τ_ee/4 — a closure exact at both crossover endpoints, Navier–Stokes with the chain’s own ν₀ as ωτ_ee → 0 and the collisionless mode as ωτ_ee → ∞ — and returns four results at the operating point. First, single-particle Landau damping at the operating q is not merely avoided but kinematically excluded, with and without drift: intraband particle-hole pairs on a Dirac cone obey |ω| ≤ v_F q identically, a property of the spectrum and not of the occupation, so Im Π_intra vanishes above v_F for any electron distribution — drifted, rigidly shifted, boosted, or thermally broadened to any temperature. The factor ≈ 2.3 of Section 5 is a margin on an identity, not on an estimate, and the counter-propagating leg — the one carrying the larger wavenumber — still retains a factor ≈ 2.1. This is the chain’s one demonstrated kinetic result; thermally unblocked interband absorption at ħω ≪ 2E_F adds &lt; 0.001 dB beside it. Second, the residual kinetic damping is signed and negative: at 353 K and the tracked M/M_th = 0.7 the per-cell gain correction is −0.95 dB, band [−1.5, −0.3] dB, with the physical threshold shifting to M_th ≈ 0.165 — ×1.12 on the analytic 0.147083, band ×[1.05, 1.15]. At 300 K the same closure gives −1.27 dB, band [−1.6, −0.5] dB, with the threshold ×1.16. The sign survives the prefactor uncertainty on 1/τ_ee, because the damping supplement is positive-definite for every τ_ee and has a bounded interior maximum at ωτ_ee = 1: a factor-of-a-few error bounds the correction’s magnitude rather than flipping its sign. The band is in-model at the closure’s own level — its ±25 % crossover allowance is judgment, not theorem, and the map from the cavity pole shift to a per-cell gain carries a ±0.2 dB translation error, inside which a 0.5-ps transit-window convention is disclosed but ad hoc and awaits pinning to the chain’s own gain definition. The correction is a decibel rather than several only because the operating point is a tracked ratio (Section 5): with M_th calibrated in situ, any multiplicative renormalization of the DS boundary gain is absorbed into bias current and leaves the tracked loop gain alone to better than 0.04 dB per ±20 %, so only additive damping and detuning move the gain. At a bias frozen at 0.7·M_th(hydro) the same 353 K correction would read −2.5 dB. Third, the mode runs slower than the design value: Eq. (1) is the collisionless endpoint, and at the operating ωτ_ee the in-closure speed deficit is −1.8 % at 353 K, band [−2.3, −1.2] %, detuning the fixed-length cavity against a model-derived 2.8 % half-linewidth at a further cost of ≈ −1.5 dB at the central deficit (−0.8 to −2.3 dB across the band) if left uncorrected. A density trim of Δn/n ≈ +7 % nulls it; the gain band above assumes that trim, which is therefore an explicit design requirement rather than an implication of the calibration philosophy, and is measurable at bench gate G1 (Section 10). Finite-temperature compressibility corrections to s at T/T_F = 0.26 are comparable in size and uncomputed, so the total speed shift’s sign remains open — the closure’s own band on the total, [−4, +1] %, contains zero; only the in-closure part is signed. Fourth, and this is what the next tier is for: an additional unsigned allowance of ±1 dB rides on top of the band, owned by kinetic boundary layers at the clamped contacts (ℓ_ee ≈ 83 nm at 353 K, ≈ 14 % of the cell, at each end). Its sign is genuinely open — the drain reflection could be kinetically enhanced as well as degraded — and its sensitivity, −0.28 dB per 1 % of additive round-trip loss, sets the accuracy the Boltzmann–Maxwell solve must reach (Section 10). Mapped onto the corrected ledger at 353 K the band reads: continuous-wave 9.661 dB → ≈ 8.7 [8.2–9.4] dB; retuned streaming 9.2246 dB → ≈ 8.3 [7.7–8.9] dB; cascade 8.40 dB/cell at the 0 dB junction → ≈ 7.45 [6.9–8.1] dB/cell. The ledger values themselves do not move — they are what the released chain computes, and this is a stated correction on them, not a rewrite of them — but two margins do, and are recorded where they arise: the thermal envelope of Section 8.2, because the threshold shift is real bias current, and the fan-out budget of Section 6.3. The note also audits Pass 5’s own validity keys: the shipped ωτ_ee = 0.722 is a 300 K number and 0.52 belongs beside it at the cap; viscous_fraction = 0.209 is likewise 300 K, omits the crossover reduction, and — the substantive finding — was never propagated into gain, the propagation being what this paragraph now reports, and it, not the raw fraction, is the design-relevant number; and hydro_expiry_K = 254.9 is retired as a concept in Section 8.3.</w:t>
+        <w:t>The hydrodynamic equations behind Eq. (2) and the Pass-3 solver assume electron-electron collisions fast enough to keep the electron system a local fluid — quantified by ωτ_ee ≪ 1. The standard estimate for graphene’s electron-electron rate, 1/τ_ee ≈ (k_BT)²/(ħE_F) [15], gives τ_ee ≈ 115 fs at 300 K and E_F = 117 meV — i.e. ωτ_ee ≈ 0.7 at 1 THz. Two qualifications belong with that number. Its rate prefactor is uncertain by a factor of a few — the Fermi-liquid log, screening and coupling-constant spreads, and the fact that the stress-relaxation time the wave actually samples is not the quasiparticle lifetime (measured graphene viscosities sit inside that band). And the group is temperature-dependent in the design’s favour: with τ_ee ∝ T⁻², at the 353 K cap τ_ee ≈ 83 fs and ωτ_ee ≈ 0.52, so hydrodynamics is better at the hot end, which is where the fabric runs. The honest statement is that the hydrodynamic description at 1 THz and 300 K is marginal, not comfortable: ωτ_ee ≈ 0.7 sits at the collisional-to-collisionless crossover — the same crossover observed experimentally as the transition from acoustic plasmon to electronic sound [10] — with ℓ_ee/L ≈ 0.2 (0.14 at the cap, where the sharper wave-kinetic Knudsen numbers are q₋·ℓ_ee = 0.25 and q₊·ℓ_ee = 0.20), and the viscous correction ν q² (ν = v_F²τ_ee/4) is ≈ 20 % of 1/τ — a 300 K figure that reads 0.13 at the cap, and that overstates the actual dissipative supplement in the conservative direction, since the collisionless crossover reduces it by 1/(1 + (ωτ_ee)²) to ≈ 0.10 of 1/τ there. The cell is marginal in space as well: L/ℓ_mfp ≈ 0.6–0.7 with ℓ_mfp = v_F·τ the momentum-relaxation mean free path, so transport in the cell is neither cleanly hydrodynamic nor cleanly ballistic. The gain numbers of Passes 3–4 therefore carry a kinetic correction, and its certification passes to the Boltzmann–Maxwell tier as that tier’s highest-priority question (Section 10) — but the correction is no longer unsigned. A community note promoted by a 3-of-3 agent vote (notes/2026-07-13-kinetic-correction-signed-band.md, July 2026) closes the system one tier up in the Maxwell/Mermin viscoelastic generalization of the shallow-water equations, ν(ω) = ν₀/(1 − iωτ_ee) with ν₀ = v_F²τ_ee/4 — a closure exact at both crossover endpoints, Navier–Stokes with the chain’s own ν₀ as ωτ_ee → 0 and the collisionless mode as ωτ_ee → ∞ — and returns four results at the operating point. First, single-particle Landau damping at the operating q is not merely avoided but kinematically excluded, with and without drift: intraband particle-hole pairs on a Dirac cone obey |ω| ≤ v_F q identically, a property of the spectrum and not of the occupation, so Im Π_intra vanishes above v_F for any electron distribution — drifted, rigidly shifted, boosted, or thermally broadened to any temperature. The factor ≈ 2.3 of Section 5 is a margin on an identity, not on an estimate, and the counter-propagating leg — the one carrying the larger wavenumber — still retains a factor ≈ 2.1. This is the chain’s one demonstrated kinetic result; thermally unblocked interband absorption at ħω ≪ 2E_F adds &lt; 0.001 dB beside it. Second, the residual kinetic damping is signed and negative: at 353 K and the tracked M/M_th = 0.7 the per-cell gain correction is −0.95 dB, band [−1.5, −0.3] dB, with the physical threshold shifting to M_th ≈ 0.165 — ×1.12 on the analytic 0.147083, band ×[1.05, 1.15]. At 300 K the same closure gives −1.27 dB, band [−1.6, −0.5] dB, with the threshold ×1.16. The sign survives the prefactor uncertainty on 1/τ_ee, because the damping supplement is positive-definite for every τ_ee and has a bounded interior maximum at ωτ_ee = 1: a factor-of-a-few error bounds the correction’s magnitude rather than flipping its sign. The band is in-model at the closure’s own level — its ±25 % crossover allowance is judgment, not theorem, and the map from the cavity pole shift to a per-cell gain carries a ±0.2 dB translation error, inside which a 0.5-ps transit-window convention is disclosed but ad hoc and awaits pinning to the chain’s own gain definition. The correction is a decibel rather than several only because the operating point is a tracked ratio (Section 5): with M_th calibrated in situ, any multiplicative renormalization of the DS boundary gain is absorbed into bias current and leaves the tracked loop gain alone to better than 0.04 dB per ±20 %, so only additive damping and detuning move the gain. At a bias frozen at 0.7·M_th(hydro) the same 353 K correction would read −2.5 dB. Third, the mode runs slower than the design value: Eq. (1) is the collisionless endpoint, and at the operating ωτ_ee the in-closure speed deficit is −1.8 % at 353 K, band [−2.3, −1.2] %, detuning the fixed-length cavity against a model-derived 2.8 % half-linewidth at a further cost of ≈ −1.5 dB at the central deficit (−0.8 to −2.3 dB across the band) if left uncorrected. A density trim of Δn/n ≈ +7 % nulls it; the gain band above assumes that trim, which is therefore an explicit design requirement rather than an implication of the calibration philosophy, and is measurable at bench gate G1 (Section 10). Finite-temperature compressibility corrections to s at T/T_F = 0.26 are comparable in size and uncomputed, so the total speed shift’s sign remains open — the closure’s own band on the total, [−4, +1] %, contains zero; only the in-closure part is signed. Fourth, and this is what the next tier — or one cheap bench measurement — is for: an additional ±1 dB allowance rides on top of the band, owned by kinetic boundary layers at the clamped contacts (ℓ_ee ≈ 83 nm at 353 K, ≈ 14 % of the cell, at each end). It does not close on paper: the boundary loss δ_b is a sign-definite loss at the density-clamped source, sign-open at the DS-active drain, and set entirely by the contact accommodation — with even its Knudsen-layer scaling exponent open — so the honest centre is a net loss and the allowance could be larger than ±1 dB, not smaller. Its sensitivity is −0.28 dB per 1 % of additive round-trip loss. What analysis can do is make it falsifiable at the bench: because δ_b is a per-reflection loss while the bulk viscous channel is distributed, three sub-threshold cavity-linewidth signatures separate them — a contact-preparation contrast isolates δ_b (≈3.2 GHz of excess half-linewidth per 1 %), a temperature sweep reads its Knudsen exponent, and a drift sweep reads the drain sign — so a near-model linewidth on a specular-contact cell gates an architecture-led Part III without the full solve, and a broad line measures the three inputs the solve otherwise owes (Section 10). Mapped onto the corrected ledger at 353 K the band reads: continuous-wave 9.661 dB → ≈ 8.7 [8.2–9.4] dB; retuned streaming 9.2246 dB → ≈ 8.3 [7.7–8.9] dB; cascade 8.40 dB/cell at the 0 dB junction → ≈ 7.45 [6.9–8.1] dB/cell. The ledger values themselves do not move — they are what the released chain computes, and this is a stated correction on them, not a rewrite of them — but two margins do, and are recorded where they arise: the thermal envelope of Section 8.2, because the threshold shift is real bias current, and the fan-out budget of Section 6.3. The note also audits Pass 5’s own validity keys: the shipped ωτ_ee = 0.722 is a 300 K number and 0.52 belongs beside it at the cap; viscous_fraction = 0.209 is likewise 300 K, omits the crossover reduction, and — the substantive finding — was never propagated into gain, the propagation being what this paragraph now reports, and it, not the raw fraction, is the design-relevant number; and hydro_expiry_K = 254.9 is retired as a concept in Section 8.3.</w:t>
       </w:r>
     </w:p>
     <w:p>
@@ -4151,7 +4151,7 @@
               <w:rPr>
                 <w:sz w:val="20"/>
               </w:rPr>
-              <w:t xml:space="preserve">marginal (ωτ_ee ≈ 0.7): tens-of-percent uncertainty on gain; passes to the Boltzmann–Maxwell tier</w:t>
+              <w:t xml:space="preserve">marginal (ωτ_ee ≈ 0.7): signed kinetic band −0.95 dB/cell at 353 K [−1.5, −0.3] dB, plus an open ±1 dB contact-boundary allowance; passes to the Boltzmann–Maxwell tier (Section 7.5)</w:t>
             </w:r>
           </w:p>
         </w:tc>
@@ -4365,7 +4365,7 @@
     </w:p>
     <w:p>
       <w:r>
-        <w:t>The certifiable window, however, is set by model validity — and the way earlier revisions stated it does not survive the promoted kinetic note (Section 7.5). The chain ships a key hydro_expiry_K = 254.9, the temperature at which ωτ_ee reaches 1 under the unit rate prefactor, and it was read as the temperature where the hydrodynamic tier that certifies every gain number here expires. Both halves of that reading fail. The number inherits the rate prefactor as 255/√A: across the admissible band it is 147–360 K, a range that contains the design temperature, so as a safety statement it is empty in both directions. And ωτ_ee = 1 is not an expiry: it is where the closure’s damping supplement is largest at a given temperature across the admissible prefactor band, and where it is bounded — at each temperature the tracked penalty has a floor over that band, ≥ −1.2 dB at 353 K and ≥ −1.6 dB at 255 K, before the closure’s own ±25 % allowance and before the open ±1 dB boundary allowance — while the mode itself demonstrably survives the crossover, which is exactly what the acoustic-plasmon-to-electronic-sound experiment [10] shows. There is no cliff at ~250 K. There is a smooth, signed penalty that deepens as the fabric cools: in-model and tracked, −0.95 dB per cell at 353 K, −1.27 dB at 300 K, −1.55 dB at 255 K. Below 255 K the closure has not been evaluated, so the 200 K end of the sweep above carries no kinetic figure at all — that end is open, and the 255 K number bounds nothing below itself. What the hydrodynamic chain certifies is unchanged: the loss trend, the tracked-bias requirement, and the absence of any predicted instability under cooling with a tracked bias. What it does not certify — the absolute gain, at any temperature — passes to the Boltzmann–Maxwell tier with the band of Section 7.5 attached, deeper at the cold end than at the cap. (Below ~150 K the 1/T phonon scaling is itself optimistic — impurity scattering saturates τ.)</w:t>
+        <w:t xml:space="preserve">The certifiable window, however, is set by model validity, and it is not a cliff. The chain ships a key hydro_expiry_K = 254.9 — the temperature at which ωτ_ee reaches 1 under the unit rate prefactor — but neither the number nor the concept behind it certifies anything. The number inherits the rate prefactor as 255/√A: across the admissible band it spans 147–360 K, a range that contains the design temperature, so as a safety statement it is empty in both directions. And ωτ_ee = 1 is not an expiry but the point where the closure’s damping supplement is largest at a given temperature and bounded there: at each temperature the tracked penalty has a floor over the prefactor band, ≥ −1.2 dB at 353 K and ≥ −1.6 dB at 255 K, before the closure’s own ±25 % allowance and before the open ±1 dB boundary allowance — while the mode itself demonstrably survives the crossover, which is exactly what the acoustic-plasmon-to-electronic-sound experiment [10] shows. What replaces the expiry picture is a smooth, signed penalty that deepens as the fabric cools: in-model and tracked, −0.95 dB per cell at 353 K, −1.27 dB at 300 K, −1.55 dB at 255 K. Below 255 K the closure has not been evaluated, so the 200 K end of the sweep above carries no kinetic figure at all — that end is open, and the 255 K number bounds nothing below itself. What the hydrodynamic chain certifies is the loss trend, the tracked-bias requirement, and the absence of any predicted instability under cooling with a tracked bias; what it does not certify — the absolute gain, at any temperature — passes to the Boltzmann–Maxwell tier with the band of Section 7.5 attached, deeper at the cold end than at the cap. (Below ~150 K the 1/T phonon scaling is itself optimistic — impurity scattering saturates τ.)</w:t>
       </w:r>
     </w:p>
     <w:p>
@@ -4389,7 +4389,7 @@
         <w:t xml:space="preserve">9.1 Boundary conditions and contacts. </w:t>
       </w:r>
       <w:r>
-        <w:t>The DS asymmetry is electrical, not geometric: density-clamped means AC-shorted gate-to-channel voltage at the source end; current-clamped means AC-open at the drain end [11, 19]. The practical realization is a low-impedance ohmic source contact (one-dimensional edge contacts at ~100 Ω·µm-class resistance [33]) under the gated region’s edge, and a drain side terminated by the gate-segment boundary into a depleted (CNP) region. No experiment has realized verified DS boundary conditions at the 576-nm scale; the design’s protection is that M_th is calibrated in situ by approach to self-oscillation, which absorbs boundary-condition imperfection into the measured threshold to first order. Residual non-ideality appears as a modified increment and is exactly what bench gate G1 measures. The kinetic note of Section 7.5 sharpens what that protection covers and what it does not. It covers the multiplicative part, and covers it well: any renormalization of the boundary-gain slope moves the threshold — bias current, dissipation — but leaves the tracked loop gain alone to better than 0.04 dB per ±20 %, which is why a defensible band exists at this order at all. It does not cover the additive part. Electron-electron collisions are slow enough at this operating point that a Knudsen layer of ℓ_ee ≈ 83 nm at the 80 °C cap — about 14 % of the cell — sits at each clamp, and whatever dissipation those layers add is charged straight to the gain at −0.28 dB per 1 % of additive round-trip loss. Its sign is open in both directions: the drain reflection could be kinetically enhanced as well as degraded. That ±1 dB allowance is the design’s largest open kinetic exposure, it is why contact fidelity leads the Boltzmann–Maxwell tier’s ingredient ranking (Section 10), and it makes the specular-versus-diffuse character of the clamps a device-physics question the bench should not be the first to answer.</w:t>
+        <w:t>The DS asymmetry is electrical, not geometric: density-clamped means AC-shorted gate-to-channel voltage at the source end; current-clamped means AC-open at the drain end [11, 19]. The practical realization is a low-impedance ohmic source contact (one-dimensional edge contacts at ~100 Ω·µm-class resistance [33]) under the gated region’s edge, and a drain side terminated by the gate-segment boundary into a depleted (CNP) region. No experiment has realized verified DS boundary conditions at the 576-nm scale; the design’s protection is that M_th is calibrated in situ by approach to self-oscillation, which absorbs boundary-condition imperfection into the measured threshold to first order. Residual non-ideality appears as a modified increment and is exactly what bench gate G1 measures. The kinetic note of Section 7.5 sharpens what that protection covers and what it does not. It covers the multiplicative part, and covers it well: any renormalization of the boundary-gain slope moves the threshold — bias current, dissipation — but leaves the tracked loop gain alone to better than 0.04 dB per ±20 %, which is why a defensible band exists at this order at all. It does not cover the additive part. Electron-electron collisions are slow enough at this operating point that a Knudsen layer of ℓ_ee ≈ 83 nm at the 80 °C cap — about 14 % of the cell — sits at each clamp, and whatever dissipation those layers add is charged straight to the gain at −0.28 dB per 1 % of additive round-trip loss. It does not close on paper: it is a sign-definite loss at the density-clamped source and sign-open only at the DS-active drain (whose reflection could be kinetically enhanced as well as degraded), so the honest centre is a net loss. That ±1 dB allowance is the design’s largest open kinetic exposure, it is why contact fidelity leads the Boltzmann–Maxwell tier’s ingredient ranking (Section 10), and it makes the specular-versus-diffuse character of the clamps a device-physics question the bench should not be the first to answer.</w:t>
       </w:r>
     </w:p>
     <w:p>
@@ -4893,7 +4893,7 @@
     </w:p>
     <w:p>
       <w:r>
-        <w:t>The remaining modeling tier — a Boltzmann–Maxwell grating-gate solve, with method precedent in [18] — owns five questions with fully specified inputs: the regenerative gain curve G(M/M_th) under kinetic and electromagnetic corrections (the tier’s highest priority, and now a falsifiable one: the kinetic part of the answer must land inside the signed band of Section 7.5); real junction loss; radiative coupling between cells (the one surviving parasitic channel, Section 7.5); absolute noise calibration against the 2.77 dB (353 K) floor; and the launch-transducer coupling efficiency. The promoted kinetic note (Section 7.5) turns the first of those from a topic into a specification, and the tier’s scoping should follow it. The accuracy target is set by the band the solve must adjudicate: to be decisive against [−1.5, −0.3] dB it must resolve per-cell gain to ±0.25 dB — the round-trip amplitude loop to ±0.0024 about its 0.916 baseline, per-unit-time damping to ±5×10⁹ s⁻¹, and additive boundary dissipation to under 1 % per round trip. The ingredients then rank, and not in the order the tier’s name suggests. Contact and boundary-condition fidelity comes first: it owns the only unbounded allowance (±1 dB, sign open, −0.28 dB per 1 % of additive round-trip loss), because a Knudsen layer of ℓ_ee ≈ 83 nm sits at each clamp at the 80 °C cap, ≈ 14 % of the cell; the multiplicative part of the same physics is tracking-protected to under 0.05 dB and needs nothing from the solve. Collision-operator fidelity at ωτ_ee ≈ 0.5–1 comes second: it owns the width of the signed band, and pinning the stress-relaxation time to within a factor of two — by computation, or by measuring the mode linewidth on the bench — shrinks that width to about ±0.3 dB. Electromagnetic coupling comes third, and is not required for this question at all: the cell is strongly gated (q₀d = 0.027) and quasistatic (ω/cq₀ = 8×10⁻³, a 10⁻⁴ effect in the dispersion), so the full-wave tier owns the other questions on the list — radiative parasitics, launch efficiency, absolute noise — and not this one. The recommendation carried here is therefore to split the tier’s first deliverable in two: a kinetic cavity solve — linearized Boltzmann on the 2D Dirac cone with a number-, momentum- and energy-conserving relaxation-time operator, about the drifted local equilibrium, on the 1D gated cavity with its quasistatic Poisson kernel, the source density clamp and drain current clamp imposed at the kinetic level, a specular-to-diffuse contact parameter swept 0 → 1, reporting ω″(M), the kinetic threshold, and the driven transfer at 0.7·M_th,kin — and, separately, the electromagnetic tier. The kinetic solve is a workstation-days job at ~10³ spatial by ~10² angular resolution, not a cluster job, and it is pre-registered against four falsifiable quantities: a tracked gain correction of −0.95 dB in [−1.5, −0.3] at 353 K; −1.27 dB in [−1.6, −0.5] at 300 K; a kinetic threshold of 0.165 in [0.154, 0.169] with specular clamps, the diffuse-contact sweep being free to move it further; and the in-closure resonance shift of Section 7.5, −1.8 % in [−2.3, −1.2] % at 353 K. These are targets for the solve, not for the bench, whose measurements carry channels the solve holds fixed (Section 9.1). A result outside those bands falsifies the closure of Section 7.5 — not the released chain, whose outputs none of them contest.</w:t>
+        <w:t>The remaining modeling tier — a Boltzmann–Maxwell grating-gate solve, with method precedent in [18] — owns five questions with fully specified inputs: the regenerative gain curve G(M/M_th) under kinetic and electromagnetic corrections (the tier’s highest priority, and now a falsifiable one: the kinetic part of the answer must land inside the signed band of Section 7.5); real junction loss; radiative coupling between cells (the one surviving parasitic channel, Section 7.5); absolute noise calibration against the 2.77 dB (353 K) floor; and the launch-transducer coupling efficiency. The promoted kinetic note (Section 7.5) turns the first of those from a topic into a specification, and the tier’s scoping should follow it. The accuracy target is set by the band the solve must adjudicate: to be decisive against [−1.5, −0.3] dB it must resolve per-cell gain to ±0.25 dB — the round-trip amplitude loop to ±0.0024 about its analytic 0.916 baseline, per-unit-time damping to ±5×10⁹ s⁻¹, and additive boundary dissipation to under 1 % per round trip. The ingredients then rank, and not in the order the tier’s name suggests. Contact and boundary-condition fidelity comes first: it owns the only unbounded allowance (±1 dB, sign open, −0.28 dB per 1 % of additive round-trip loss), because a Knudsen layer of ℓ_ee ≈ 83 nm sits at each clamp at the 80 °C cap, ≈ 14 % of the cell; the multiplicative part of the same physics is tracking-protected to under 0.05 dB and needs nothing from the solve. The boundary channel also now has a cheap bench test ahead of the solve: because δ_b is a per-reflection loss while the bulk viscous channel is distributed, three sub-threshold cavity-linewidth signatures separate them — a contact-preparation contrast isolates δ_b directly (≈3.2 GHz of excess half-linewidth per 1 % additive round-trip loss), a temperature sweep reads its Knudsen exponent (the bulk viscous term peaks at ωτ_ee ≈ 1 near 255 K while δ_b is monotone in T), and a drift sweep reads the sign of the drain term (notes/2026-07-18-boundary-channel-bench-discriminants.md). A near-model linewidth on a specular-contact cell therefore gates an architecture-led Part III on data, without waiting for the full kinetic solve; a broad line measures the three inputs the solve otherwise owes. Collision-operator fidelity at ωτ_ee ≈ 0.5–1 comes second: it owns the width of the signed band, and pinning the stress-relaxation time to within a factor of two — by computation, or by measuring the mode linewidth on the bench — shrinks that width to about ±0.3 dB. Electromagnetic coupling comes third, and is not required for this question at all: the cell is strongly gated (q₀d = 0.027) and quasistatic (ω/cq₀ = 8×10⁻³, a 10⁻⁴ effect in the dispersion), so the full-wave tier owns the other questions on the list — radiative parasitics, launch efficiency, absolute noise — and not this one. The recommendation carried here is therefore to split the tier’s first deliverable in two: a kinetic cavity solve — linearized Boltzmann on the 2D Dirac cone with a number-, momentum- and energy-conserving relaxation-time operator, about the drifted local equilibrium, on the 1D gated cavity with its quasistatic Poisson kernel, the source density clamp and drain current clamp imposed at the kinetic level, a specular-to-diffuse contact parameter swept 0 → 1, reporting ω″(M), the kinetic threshold, and the driven transfer at 0.7·M_th,kin — and, separately, the electromagnetic tier. The kinetic solve is a workstation-days job at ~10³ spatial by ~10² angular resolution, not a cluster job, and it is pre-registered against four falsifiable quantities: a tracked gain correction of −0.95 dB in [−1.5, −0.3] at 353 K; −1.27 dB in [−1.6, −0.5] at 300 K; a kinetic threshold of 0.165 in [0.154, 0.169] with specular clamps, the diffuse-contact sweep being free to move it further; and the in-closure resonance shift of Section 7.5, −1.8 % in [−2.3, −1.2] % at 353 K. These are targets for the solve, not for the bench, whose measurements carry channels the solve holds fixed (Section 9.1). A result outside those bands falsifies the closure of Section 7.5 — not the released chain, whose outputs none of them contest.</w:t>
       </w:r>
     </w:p>
     <w:p>
@@ -4936,6 +4936,49 @@
         <w:pStyle w:val="Heading2"/>
       </w:pPr>
       <w:r>
+        <w:t xml:space="preserve">Revision notes — v5.5 → v5.6 (July 2026)</w:t>
+      </w:r>
+    </w:p>
+    <w:p>
+      <w:r>
+        <w:t xml:space="preserve">This update folds the community’s boundary-kinetics resolution and the drive-sweep calibration — notes/2026-07-18-boundary-channel-contact-gated.md (promoted 3-of-3), notes/2026-07-18-boundary-channel-bench-discriminants.md (promoted 3-of-3), and notes/2026-07-17-drive-sweep-knee-anchored.md (promoted 3-of-3). No released-chain output changed; the v5.5 and earlier sections below stand unchanged as the record of their progression.</w:t>
+      </w:r>
+    </w:p>
+    <w:p>
+      <w:r>
+        <w:t xml:space="preserve">1. The ±1 dB boundary allowance named in v5.5 (item 6) does not close on paper, and the reason is structural (Sections 7.5, 10). The boundary term δ_b is a sign-definite loss at the source (entropy production ≥ 0 at the passive density clamp), sign-open at the drain (the DS-active current clamp, which can dissipate or enhance the drift-to-plasmon conversion), and set entirely by the contact accommodation C_acc, with even the Knudsen-layer scaling exponent open — O(Kn) versus O(Kn²), Kn = q·ℓ_ee ≈ 0.25. The reactive (slip) part is trim-absorbed, a static length redefinition with under 0.1 dB residual; the additive dissipative part is the whole of the channel’s effect on the tracked gain. The honest center is a net loss rather than zero, and the allowance could be worse than ±1 dB — a diffuse-edge −3 dB under the Kn² law, ≲ −10 dB under the Kn law — not better. So the analysis did not shrink the allowance; the per-cell gain budget stays gated on a contact parameter the released model does not carry.</w:t>
+      </w:r>
+    </w:p>
+    <w:p>
+      <w:r>
+        <w:t xml:space="preserve">2. But the gate is made two-sided and bench-falsifiable, which is the substantive advance (Sections 7.5, 10). Because δ_b is a per-reflection loss and the bulk viscous channel is distributed, the two have distinct parametric signatures and a small matrix of sub-threshold linewidth measurements over-determines them: (i) a contact-preparation contrast at matched geometry cancels the bulk exactly and isolates δ_b (≈3.2 GHz of excess half-linewidth per 1 % additive loss, verified against the released chain); (ii) a temperature sweep closes the Knudsen exponent, since the bulk viscous term is non-monotone — peaking at ωτ_ee ≈ 1 near 255 K — while δ_b is monotone T^(−2p), so the residual slope reads p; (iii) a drift sweep reads the drain sign, since the bulk drift factor is even in M and tame (+5.4 %) while the DS-active drain rides r(M), a ±1 % drain term moving the fixed-bias linewidth by ∓10.5 %. The three are mostly room-temperature and belong to WP1/WP4 ahead of the full WP2 solve. Either outcome advances Part III: a near-model linewidth on a specular-contact cell gates an architecture-led Part III on data; a broad line measures the three inputs WP2 owed — δ_b, its exponent, and the drain sign. This turns the one-sided confirmatory test v5.5 pointed at into a discriminating, falsifiable gate, and it is the deliverable most directly requested of this revision.</w:t>
+      </w:r>
+    </w:p>
+    <w:p>
+      <w:r>
+        <w:t xml:space="preserve">3. The CW/pulse gain-budget residual is bench-resolved, with the compression-versus-estimator split earlier revisions left open now measured — and its proportions inverted (Section 7.3, Appendix A). A drive-amplitude sweep of the released solver splits the retuned ≈0.94 dB residual as ≈0.87 dB pulse-train / per-slot-peak-estimator convention plus only ≈0.06 dB compression at the operating drive; the earlier in-model split (≈0.5 dB compression + ≈0.4 dB estimator) had the right sum and inverted proportions, overestimating compression roughly eightfold. A_SAT = 0.02 is confirmed at the drive plane the cascade budget actually uses (A_SAT_eff ∈ [0.015 CW, 0.023 pulse]).</w:t>
+      </w:r>
+    </w:p>
+    <w:p>
+      <w:r>
+        <w:t xml:space="preserve">4. A reference-plane correction is recorded, landing mostly in Part II (Section 7.3; Part II Sections 3–4). The “1 % compression knee” is a drive/source-plane density swing — the plane cell.py’s cascade correctly uses — not an intracavity one. Measured at the intracavity plane the same knee sits at ≈14–15 % swing, so quoting it as “≈38 intracavity quanta,” the phrasing Part II’s quantization language uses, is a reference-plane mislabel: the knee is a launch/drive-plane quantity (input-referred ≈22–51 quanta, bracketing 38). Part I’s own usage is at the correct plane and is unchanged; Part II v1.7 carries the wording fix.</w:t>
+      </w:r>
+    </w:p>
+    <w:p>
+      <w:r>
+        <w:t xml:space="preserve">5. Nothing here is offset by a compensating upgrade, and the boundary channel — the design’s largest open kinetic exposure — remains open in magnitude and in the drain’s sign. What changed is its character: it is now a measurable open, with a specified, cheap, mostly-room-temperature protocol that decides the Part III gate either way, rather than an unmeasurable one.</w:t>
+      </w:r>
+    </w:p>
+    <w:p>
+      <w:r>
+        <w:t xml:space="preserve">6. Sections 7.5 and 8.3 consolidated (this revision). The Section 8.3 body now states the smooth, signed cooling penalty directly rather than as a refutation of the retired “hydro expiry” reading, and the Section 7.5 boundary paragraph now states the contact-gated, bench-falsifiable understanding of items 1–2 above directly rather than the earlier unsigned-allowance phrasing. No claim or number changed; the retired framings are retained verbatim in the revision notes (the v5.4 → v5.5 block’s hydro-expiry and boundary-allowance items), which remain the append-only record.</w:t>
+      </w:r>
+    </w:p>
+    <w:p>
+      <w:pPr>
+        <w:pStyle w:val="Heading2"/>
+      </w:pPr>
+      <w:r>
         <w:t>Revision notes — v5.4 → v5.5 (July 2026)</w:t>
       </w:r>
     </w:p>
@@ -4978,7 +5021,7 @@
     <w:p>
       <w:pPr/>
       <w:r>
-        <w:t>6. The dominant open item is named and quantified (Sections 9.1, 10). Kinetic boundary layers at the clamped contacts — ℓ_ee ≈ 83 nm at 353 K, ≈ 14 % of the cell at each end — carry an unsigned ±1 dB allowance that rides on top of the signed band, with a sensitivity of −0.28 dB per 1 % of additive round-trip loss and a sign genuinely open in both directions. The in-situ tracking that protects the tracked gain against multiplicative boundary non-ideality (to better than 0.04 dB per ±20 %) gives no protection whatever against this additive channel. It is the design’s largest open kinetic exposure and, by the note’s own account, the band’s most likely killer.</w:t>
+        <w:t>6. The dominant open item is named and quantified (Sections 9.1, 10). Kinetic boundary layers at the clamped contacts — ℓ_ee ≈ 83 nm at 353 K, ≈ 14 % of the cell at each end — carry an unsigned ±1 dB allowance that rides on top of the signed band, with a sensitivity of −0.28 dB per 1 % of additive round-trip loss and a sign that is definite (a loss) at the source and open only at the drain. The in-situ tracking that protects the tracked gain against multiplicative boundary non-ideality (to better than 0.04 dB per ±20 %) gives no protection whatever against this additive channel. It is the design’s largest open kinetic exposure and, by the note’s own account, the band’s most likely killer.</w:t>
       </w:r>
     </w:p>
     <w:p>
@@ -5055,7 +5098,7 @@
     </w:p>
     <w:p>
       <w:r>
-        <w:t xml:space="preserve">2. Gap decomposition superseded (Section 7.3): v5.2’s penalty-formula partition (drive detuning 1.36 ± 0.20 dB; residual 0.50 ± 0.17 dB) is replaced by the exact split — linear numerics 0.956 dB, nonlinear/pulse-train/estimator 0.909 dB. The effective round-trip amplitude is now exact (l_a = 0.9110), and the boundary loss is identified as drift-induced with no scalar boundary factor (the passive cavity’s boundaries are lossless in-model).</w:t>
+        <w:t xml:space="preserve">2. Gap decomposition superseded (Section 7.3): v5.2’s penalty-formula partition (drive detuning 1.36 ± 0.20 dB; residual 0.50 ± 0.17 dB) is replaced by the exact split — linear numerics 0.956 dB, nonlinear/pulse-train/estimator 0.908 dB. The effective round-trip amplitude is now exact (l_a = 0.9110), and the boundary loss is identified as drift-induced with no scalar boundary factor (the passive cavity’s boundaries are lossless in-model).</w:t>
       </w:r>
     </w:p>
     <w:p>
@@ -5164,7 +5207,7 @@
     </w:p>
     <w:p>
       <w:r>
-        <w:t>Two properties of the chain are stated plainly so the “in-model” label is never mistaken for more than it is. The analytic backbone (Eqs. 1–7, the thermal and kinetic estimates) is closed-form and reproduces the operating point from first principles. The regenerative gain is owned by the analytic cavity transfer (regen.py) and independently confirmed by the nonlinear shallow-water solver (solver.py); the solver’s absolute gain calibration carries the numerical-diffusion caveat above, along with the calibration structure now derived exactly by community review (July 2026): the exact linearized operator of the released scheme (runnable listing in the promoted notes) attributes 0.956 dB of the CW/streaming difference to linear numerics — drive detuning from the zero-drift cavity length, interior diffusion, and a drift-induced boundary loss — and the remaining 0.909 dB to pulse-train structure, a drive amplitude (3×10⁻³) near the compression knee, and the per-slot estimator (split open) — which is why the per-pulse figure is quoted conservatively; the retuned-run and N = 480 predictions were run and confirmed in July 2026 (+9.22 dB measured; 0.158748 measured), with baselines replicated bit-for-bit — see notes/2026-07-12-predictions-resolved.md and REPLICATIONS.md. Two previously undocumented transfer-model parameters are now stated: the cascade operating swing A_op = 0.0116 and the compression knee A_SAT = 0.02 (cell.py). Table A1 maps each pass to its module:</w:t>
+        <w:t>Two properties of the chain are stated plainly so the “in-model” label is never mistaken for more than it is. The analytic backbone (Eqs. 1–7, the thermal and kinetic estimates) is closed-form and reproduces the operating point from first principles. The regenerative gain is owned by the analytic cavity transfer (regen.py) and independently confirmed by the nonlinear shallow-water solver (solver.py); the solver’s absolute gain calibration carries the numerical-diffusion caveat above, along with the calibration structure now derived exactly by community review (July 2026): the exact linearized operator of the released scheme (runnable listing in the promoted notes) attributes 0.956 dB of the CW/streaming difference to linear numerics — drive detuning from the zero-drift cavity length, interior diffusion, and a drift-induced boundary loss — and the remaining 0.908 dB to pulse-train structure, a drive amplitude (3×10⁻³) near the compression knee, and the per-slot estimator — a drive sweep since splits these as ≈0.06 dB compression and ≈0.87 dB estimator convention — which is why the per-pulse figure is quoted conservatively; the retuned-run and N = 480 predictions were run and confirmed in July 2026 (+9.22 dB measured; 0.158748 measured), with baselines replicated bit-for-bit — see notes/2026-07-12-predictions-resolved.md and REPLICATIONS.md. Two previously undocumented transfer-model parameters are now stated: the cascade operating swing A_op = 0.0116 and the compression knee A_SAT = 0.02 (cell.py). Table A1 maps each pass to its module:</w:t>
       </w:r>
     </w:p>
     <w:tbl>

</xml_diff>